<commit_message>
Report: add Appendix D with formal equations for all 5 methods
Numbered equations (1)-(7) for EW, MV, Max Sharpe, Risk Parity, and HRP
(3 steps), each ending in a comma with a "where ..." definition sentence,
matched to src/portfolio.py (Max Sharpe uses the real window-mean RF).

- Rendered via matplotlib mathtext to PNGs (python-docx has no reliable
  OMML path), embedded centred with the number right-flushed via tab stops.
- Placed in a new Appendix D (excluded from the word cap) with a one-line
  pointer in Section 1.2; body 4,269 words, 0 em dashes.
- build_report.py: EQUATION/H3 helpers + equation renderer.

Co-Authored-By: Claude Opus 4.8 <noreply@anthropic.com>
</commit_message>
<xml_diff>
--- a/report/report.docx
+++ b/report/report.docx
@@ -270,6 +270,18 @@
           <w:sz w:val="22"/>
         </w:rPr>
         <w:t>Hierarchical Risk Parity, from Lopez de Prado (2016), allocates risk without ever inverting the covariance matrix, the step that makes Minimum Variance and Maximum Sharpe fragile on noisy or near-singular matrices. It runs in three stages. Tree clustering first groups assets by a correlation distance, so that assets moving together sit in the same branch. Quasi-diagonalisation then reorders the covariance matrix to place correlated assets next to one another. Recursive bisection finally walks down the tree, splitting capital between each pair of branches in inverse proportion to their variance, so the calmer branch receives more. A synthetic four-asset test, with two low-variance and two high-variance assets and near-zero cross-correlation, confirms the mechanism: HRP places 0.901 of its weight on the low-variance cluster and 0.099 on the high-variance one, matching the paper's prediction.</w:t>
+      </w:r>
+    </w:p>
+    <w:p>
+      <w:pPr>
+        <w:spacing w:after="160"/>
+      </w:pPr>
+      <w:r>
+        <w:rPr>
+          <w:rFonts w:ascii="Aptos" w:hAnsi="Aptos"/>
+          <w:sz w:val="22"/>
+        </w:rPr>
+        <w:t>The formal specification of each method, with every symbol defined, is in Appendix D.</w:t>
       </w:r>
     </w:p>
     <w:p>
@@ -3728,6 +3740,540 @@
       </w:r>
     </w:p>
     <w:p>
+      <w:pPr>
+        <w:pStyle w:val="Heading2"/>
+      </w:pPr>
+      <w:r>
+        <w:t>D. Formal specification of the portfolio methods</w:t>
+      </w:r>
+    </w:p>
+    <w:p>
+      <w:pPr>
+        <w:spacing w:after="160"/>
+      </w:pPr>
+      <w:r>
+        <w:rPr>
+          <w:rFonts w:ascii="Aptos" w:hAnsi="Aptos"/>
+          <w:sz w:val="22"/>
+        </w:rPr>
+        <w:t>Each fund maps the trailing 252-day window of daily returns to a set of weights by one of five rules. Equations (1) to (7) restate exactly what src/portfolio.py computes. All five methods are long-only and fully invested by construction or constraint, with w_i greater than or equal to 0 and the weights summing to 1.</w:t>
+      </w:r>
+    </w:p>
+    <w:p>
+      <w:pPr>
+        <w:pStyle w:val="Heading3"/>
+      </w:pPr>
+      <w:r>
+        <w:t>Equal Weight</w:t>
+      </w:r>
+    </w:p>
+    <w:p>
+      <w:pPr>
+        <w:tabs>
+          <w:tab w:pos="4514" w:val="center"/>
+          <w:tab w:pos="9029" w:val="right"/>
+        </w:tabs>
+        <w:spacing w:before="80" w:after="40"/>
+      </w:pPr>
+      <w:r>
+        <w:tab/>
+      </w:r>
+      <w:r>
+        <w:drawing>
+          <wp:inline xmlns:a="http://schemas.openxmlformats.org/drawingml/2006/main" xmlns:pic="http://schemas.openxmlformats.org/drawingml/2006/picture">
+            <wp:extent cx="2007107" cy="384048"/>
+            <wp:docPr id="8" name="Picture 8"/>
+            <wp:cNvGraphicFramePr>
+              <a:graphicFrameLocks noChangeAspect="1"/>
+            </wp:cNvGraphicFramePr>
+            <a:graphic>
+              <a:graphicData uri="http://schemas.openxmlformats.org/drawingml/2006/picture">
+                <pic:pic>
+                  <pic:nvPicPr>
+                    <pic:cNvPr id="0" name="eq1.png"/>
+                    <pic:cNvPicPr/>
+                  </pic:nvPicPr>
+                  <pic:blipFill>
+                    <a:blip r:embed="rId17"/>
+                    <a:stretch>
+                      <a:fillRect/>
+                    </a:stretch>
+                  </pic:blipFill>
+                  <pic:spPr>
+                    <a:xfrm>
+                      <a:off x="0" y="0"/>
+                      <a:ext cx="2007107" cy="384048"/>
+                    </a:xfrm>
+                    <a:prstGeom prst="rect"/>
+                  </pic:spPr>
+                </pic:pic>
+              </a:graphicData>
+            </a:graphic>
+          </wp:inline>
+        </w:drawing>
+      </w:r>
+      <w:r>
+        <w:rPr>
+          <w:rFonts w:ascii="Aptos" w:hAnsi="Aptos"/>
+          <w:sz w:val="22"/>
+        </w:rPr>
+        <w:tab/>
+        <w:t>(1)</w:t>
+      </w:r>
+    </w:p>
+    <w:p>
+      <w:pPr>
+        <w:spacing w:after="160"/>
+      </w:pPr>
+      <w:r>
+        <w:rPr>
+          <w:rFonts w:ascii="Aptos" w:hAnsi="Aptos"/>
+          <w:sz w:val="22"/>
+        </w:rPr>
+        <w:t>where N is the number of assets in the fund.</w:t>
+      </w:r>
+    </w:p>
+    <w:p>
+      <w:pPr>
+        <w:pStyle w:val="Heading3"/>
+      </w:pPr>
+      <w:r>
+        <w:t>Minimum Variance</w:t>
+      </w:r>
+    </w:p>
+    <w:p>
+      <w:pPr>
+        <w:tabs>
+          <w:tab w:pos="4514" w:val="center"/>
+          <w:tab w:pos="9029" w:val="right"/>
+        </w:tabs>
+        <w:spacing w:before="80" w:after="40"/>
+      </w:pPr>
+      <w:r>
+        <w:tab/>
+      </w:r>
+      <w:r>
+        <w:drawing>
+          <wp:inline xmlns:a="http://schemas.openxmlformats.org/drawingml/2006/main" xmlns:pic="http://schemas.openxmlformats.org/drawingml/2006/picture">
+            <wp:extent cx="3639312" cy="406908"/>
+            <wp:docPr id="9" name="Picture 9"/>
+            <wp:cNvGraphicFramePr>
+              <a:graphicFrameLocks noChangeAspect="1"/>
+            </wp:cNvGraphicFramePr>
+            <a:graphic>
+              <a:graphicData uri="http://schemas.openxmlformats.org/drawingml/2006/picture">
+                <pic:pic>
+                  <pic:nvPicPr>
+                    <pic:cNvPr id="0" name="eq2.png"/>
+                    <pic:cNvPicPr/>
+                  </pic:nvPicPr>
+                  <pic:blipFill>
+                    <a:blip r:embed="rId18"/>
+                    <a:stretch>
+                      <a:fillRect/>
+                    </a:stretch>
+                  </pic:blipFill>
+                  <pic:spPr>
+                    <a:xfrm>
+                      <a:off x="0" y="0"/>
+                      <a:ext cx="3639312" cy="406908"/>
+                    </a:xfrm>
+                    <a:prstGeom prst="rect"/>
+                  </pic:spPr>
+                </pic:pic>
+              </a:graphicData>
+            </a:graphic>
+          </wp:inline>
+        </w:drawing>
+      </w:r>
+      <w:r>
+        <w:rPr>
+          <w:rFonts w:ascii="Aptos" w:hAnsi="Aptos"/>
+          <w:sz w:val="22"/>
+        </w:rPr>
+        <w:tab/>
+        <w:t>(2)</w:t>
+      </w:r>
+    </w:p>
+    <w:p>
+      <w:pPr>
+        <w:spacing w:after="160"/>
+      </w:pPr>
+      <w:r>
+        <w:rPr>
+          <w:rFonts w:ascii="Aptos" w:hAnsi="Aptos"/>
+          <w:sz w:val="22"/>
+        </w:rPr>
+        <w:t>where Σ is the sample covariance matrix of daily returns over the estimation window.</w:t>
+      </w:r>
+    </w:p>
+    <w:p>
+      <w:pPr>
+        <w:pStyle w:val="Heading3"/>
+      </w:pPr>
+      <w:r>
+        <w:t>Maximum Sharpe (tangency portfolio)</w:t>
+      </w:r>
+    </w:p>
+    <w:p>
+      <w:pPr>
+        <w:tabs>
+          <w:tab w:pos="4514" w:val="center"/>
+          <w:tab w:pos="9029" w:val="right"/>
+        </w:tabs>
+        <w:spacing w:before="80" w:after="40"/>
+      </w:pPr>
+      <w:r>
+        <w:tab/>
+      </w:r>
+      <w:r>
+        <w:drawing>
+          <wp:inline xmlns:a="http://schemas.openxmlformats.org/drawingml/2006/main" xmlns:pic="http://schemas.openxmlformats.org/drawingml/2006/picture">
+            <wp:extent cx="3794760" cy="493776"/>
+            <wp:docPr id="10" name="Picture 10"/>
+            <wp:cNvGraphicFramePr>
+              <a:graphicFrameLocks noChangeAspect="1"/>
+            </wp:cNvGraphicFramePr>
+            <a:graphic>
+              <a:graphicData uri="http://schemas.openxmlformats.org/drawingml/2006/picture">
+                <pic:pic>
+                  <pic:nvPicPr>
+                    <pic:cNvPr id="0" name="eq3.png"/>
+                    <pic:cNvPicPr/>
+                  </pic:nvPicPr>
+                  <pic:blipFill>
+                    <a:blip r:embed="rId19"/>
+                    <a:stretch>
+                      <a:fillRect/>
+                    </a:stretch>
+                  </pic:blipFill>
+                  <pic:spPr>
+                    <a:xfrm>
+                      <a:off x="0" y="0"/>
+                      <a:ext cx="3794760" cy="493776"/>
+                    </a:xfrm>
+                    <a:prstGeom prst="rect"/>
+                  </pic:spPr>
+                </pic:pic>
+              </a:graphicData>
+            </a:graphic>
+          </wp:inline>
+        </w:drawing>
+      </w:r>
+      <w:r>
+        <w:rPr>
+          <w:rFonts w:ascii="Aptos" w:hAnsi="Aptos"/>
+          <w:sz w:val="22"/>
+        </w:rPr>
+        <w:tab/>
+        <w:t>(3)</w:t>
+      </w:r>
+    </w:p>
+    <w:p>
+      <w:pPr>
+        <w:spacing w:after="160"/>
+      </w:pPr>
+      <w:r>
+        <w:rPr>
+          <w:rFonts w:ascii="Aptos" w:hAnsi="Aptos"/>
+          <w:sz w:val="22"/>
+        </w:rPr>
+        <w:t>where μ is the sample mean daily return vector and r_f is the mean daily risk-free rate over the same estimation window (the real Fama and French rate, not zero).</w:t>
+      </w:r>
+    </w:p>
+    <w:p>
+      <w:pPr>
+        <w:pStyle w:val="Heading3"/>
+      </w:pPr>
+      <w:r>
+        <w:t>Risk Parity</w:t>
+      </w:r>
+    </w:p>
+    <w:p>
+      <w:pPr>
+        <w:tabs>
+          <w:tab w:pos="4514" w:val="center"/>
+          <w:tab w:pos="9029" w:val="right"/>
+        </w:tabs>
+        <w:spacing w:before="80" w:after="40"/>
+      </w:pPr>
+      <w:r>
+        <w:tab/>
+      </w:r>
+      <w:r>
+        <w:drawing>
+          <wp:inline xmlns:a="http://schemas.openxmlformats.org/drawingml/2006/main" xmlns:pic="http://schemas.openxmlformats.org/drawingml/2006/picture">
+            <wp:extent cx="4082796" cy="653796"/>
+            <wp:docPr id="11" name="Picture 11"/>
+            <wp:cNvGraphicFramePr>
+              <a:graphicFrameLocks noChangeAspect="1"/>
+            </wp:cNvGraphicFramePr>
+            <a:graphic>
+              <a:graphicData uri="http://schemas.openxmlformats.org/drawingml/2006/picture">
+                <pic:pic>
+                  <pic:nvPicPr>
+                    <pic:cNvPr id="0" name="eq4.png"/>
+                    <pic:cNvPicPr/>
+                  </pic:nvPicPr>
+                  <pic:blipFill>
+                    <a:blip r:embed="rId20"/>
+                    <a:stretch>
+                      <a:fillRect/>
+                    </a:stretch>
+                  </pic:blipFill>
+                  <pic:spPr>
+                    <a:xfrm>
+                      <a:off x="0" y="0"/>
+                      <a:ext cx="4082796" cy="653796"/>
+                    </a:xfrm>
+                    <a:prstGeom prst="rect"/>
+                  </pic:spPr>
+                </pic:pic>
+              </a:graphicData>
+            </a:graphic>
+          </wp:inline>
+        </w:drawing>
+      </w:r>
+      <w:r>
+        <w:rPr>
+          <w:rFonts w:ascii="Aptos" w:hAnsi="Aptos"/>
+          <w:sz w:val="22"/>
+        </w:rPr>
+        <w:tab/>
+        <w:t>(4)</w:t>
+      </w:r>
+    </w:p>
+    <w:p>
+      <w:pPr>
+        <w:spacing w:after="160"/>
+      </w:pPr>
+      <w:r>
+        <w:rPr>
+          <w:rFonts w:ascii="Aptos" w:hAnsi="Aptos"/>
+          <w:sz w:val="22"/>
+        </w:rPr>
+        <w:t>where w_i(Σw)_i / (w′Σw) is asset i's fractional contribution to total portfolio risk, equalised across all assets at the optimum.</w:t>
+      </w:r>
+    </w:p>
+    <w:p>
+      <w:pPr>
+        <w:pStyle w:val="Heading3"/>
+      </w:pPr>
+      <w:r>
+        <w:t>Hierarchical Risk Parity (López de Prado, 2016)</w:t>
+      </w:r>
+    </w:p>
+    <w:p>
+      <w:pPr>
+        <w:spacing w:after="160"/>
+      </w:pPr>
+      <w:r>
+        <w:rPr>
+          <w:rFonts w:ascii="Aptos" w:hAnsi="Aptos"/>
+          <w:sz w:val="22"/>
+        </w:rPr>
+        <w:t>HRP allocates risk in three steps: tree clustering on a correlation distance, quasi-diagonalisation, and recursive bisection.</w:t>
+      </w:r>
+    </w:p>
+    <w:p>
+      <w:pPr>
+        <w:tabs>
+          <w:tab w:pos="4514" w:val="center"/>
+          <w:tab w:pos="9029" w:val="right"/>
+        </w:tabs>
+        <w:spacing w:before="80" w:after="40"/>
+      </w:pPr>
+      <w:r>
+        <w:tab/>
+      </w:r>
+      <w:r>
+        <w:drawing>
+          <wp:inline xmlns:a="http://schemas.openxmlformats.org/drawingml/2006/main" xmlns:pic="http://schemas.openxmlformats.org/drawingml/2006/picture">
+            <wp:extent cx="1764792" cy="452628"/>
+            <wp:docPr id="12" name="Picture 12"/>
+            <wp:cNvGraphicFramePr>
+              <a:graphicFrameLocks noChangeAspect="1"/>
+            </wp:cNvGraphicFramePr>
+            <a:graphic>
+              <a:graphicData uri="http://schemas.openxmlformats.org/drawingml/2006/picture">
+                <pic:pic>
+                  <pic:nvPicPr>
+                    <pic:cNvPr id="0" name="eq5.png"/>
+                    <pic:cNvPicPr/>
+                  </pic:nvPicPr>
+                  <pic:blipFill>
+                    <a:blip r:embed="rId21"/>
+                    <a:stretch>
+                      <a:fillRect/>
+                    </a:stretch>
+                  </pic:blipFill>
+                  <pic:spPr>
+                    <a:xfrm>
+                      <a:off x="0" y="0"/>
+                      <a:ext cx="1764792" cy="452628"/>
+                    </a:xfrm>
+                    <a:prstGeom prst="rect"/>
+                  </pic:spPr>
+                </pic:pic>
+              </a:graphicData>
+            </a:graphic>
+          </wp:inline>
+        </w:drawing>
+      </w:r>
+      <w:r>
+        <w:rPr>
+          <w:rFonts w:ascii="Aptos" w:hAnsi="Aptos"/>
+          <w:sz w:val="22"/>
+        </w:rPr>
+        <w:tab/>
+        <w:t>(5)</w:t>
+      </w:r>
+    </w:p>
+    <w:p>
+      <w:pPr>
+        <w:spacing w:after="160"/>
+      </w:pPr>
+      <w:r>
+        <w:rPr>
+          <w:rFonts w:ascii="Aptos" w:hAnsi="Aptos"/>
+          <w:sz w:val="22"/>
+        </w:rPr>
+        <w:t>where ρ_{i,j} is the sample correlation between assets i and j, used to build the distance matrix for tree clustering.</w:t>
+      </w:r>
+    </w:p>
+    <w:p>
+      <w:pPr>
+        <w:tabs>
+          <w:tab w:pos="4514" w:val="center"/>
+          <w:tab w:pos="9029" w:val="right"/>
+        </w:tabs>
+        <w:spacing w:before="80" w:after="40"/>
+      </w:pPr>
+      <w:r>
+        <w:tab/>
+      </w:r>
+      <w:r>
+        <w:drawing>
+          <wp:inline xmlns:a="http://schemas.openxmlformats.org/drawingml/2006/main" xmlns:pic="http://schemas.openxmlformats.org/drawingml/2006/picture">
+            <wp:extent cx="2825496" cy="640080"/>
+            <wp:docPr id="13" name="Picture 13"/>
+            <wp:cNvGraphicFramePr>
+              <a:graphicFrameLocks noChangeAspect="1"/>
+            </wp:cNvGraphicFramePr>
+            <a:graphic>
+              <a:graphicData uri="http://schemas.openxmlformats.org/drawingml/2006/picture">
+                <pic:pic>
+                  <pic:nvPicPr>
+                    <pic:cNvPr id="0" name="eq6.png"/>
+                    <pic:cNvPicPr/>
+                  </pic:nvPicPr>
+                  <pic:blipFill>
+                    <a:blip r:embed="rId22"/>
+                    <a:stretch>
+                      <a:fillRect/>
+                    </a:stretch>
+                  </pic:blipFill>
+                  <pic:spPr>
+                    <a:xfrm>
+                      <a:off x="0" y="0"/>
+                      <a:ext cx="2825496" cy="640080"/>
+                    </a:xfrm>
+                    <a:prstGeom prst="rect"/>
+                  </pic:spPr>
+                </pic:pic>
+              </a:graphicData>
+            </a:graphic>
+          </wp:inline>
+        </w:drawing>
+      </w:r>
+      <w:r>
+        <w:rPr>
+          <w:rFonts w:ascii="Aptos" w:hAnsi="Aptos"/>
+          <w:sz w:val="22"/>
+        </w:rPr>
+        <w:tab/>
+        <w:t>(6)</w:t>
+      </w:r>
+    </w:p>
+    <w:p>
+      <w:pPr>
+        <w:spacing w:after="160"/>
+      </w:pPr>
+      <w:r>
+        <w:rPr>
+          <w:rFonts w:ascii="Aptos" w:hAnsi="Aptos"/>
+          <w:sz w:val="22"/>
+        </w:rPr>
+        <w:t>where V_C is a cluster's variance under inverse-variance weighting and σ_i² is asset i's variance, used to compare two candidate sub-clusters at each split.</w:t>
+      </w:r>
+    </w:p>
+    <w:p>
+      <w:pPr>
+        <w:tabs>
+          <w:tab w:pos="4514" w:val="center"/>
+          <w:tab w:pos="9029" w:val="right"/>
+        </w:tabs>
+        <w:spacing w:before="80" w:after="40"/>
+      </w:pPr>
+      <w:r>
+        <w:tab/>
+      </w:r>
+      <w:r>
+        <w:drawing>
+          <wp:inline xmlns:a="http://schemas.openxmlformats.org/drawingml/2006/main" xmlns:pic="http://schemas.openxmlformats.org/drawingml/2006/picture">
+            <wp:extent cx="4937760" cy="410752"/>
+            <wp:docPr id="14" name="Picture 14"/>
+            <wp:cNvGraphicFramePr>
+              <a:graphicFrameLocks noChangeAspect="1"/>
+            </wp:cNvGraphicFramePr>
+            <a:graphic>
+              <a:graphicData uri="http://schemas.openxmlformats.org/drawingml/2006/picture">
+                <pic:pic>
+                  <pic:nvPicPr>
+                    <pic:cNvPr id="0" name="eq7.png"/>
+                    <pic:cNvPicPr/>
+                  </pic:nvPicPr>
+                  <pic:blipFill>
+                    <a:blip r:embed="rId23"/>
+                    <a:stretch>
+                      <a:fillRect/>
+                    </a:stretch>
+                  </pic:blipFill>
+                  <pic:spPr>
+                    <a:xfrm>
+                      <a:off x="0" y="0"/>
+                      <a:ext cx="4937760" cy="410752"/>
+                    </a:xfrm>
+                    <a:prstGeom prst="rect"/>
+                  </pic:spPr>
+                </pic:pic>
+              </a:graphicData>
+            </a:graphic>
+          </wp:inline>
+        </w:drawing>
+      </w:r>
+      <w:r>
+        <w:rPr>
+          <w:rFonts w:ascii="Aptos" w:hAnsi="Aptos"/>
+          <w:sz w:val="22"/>
+        </w:rPr>
+        <w:tab/>
+        <w:t>(7)</w:t>
+      </w:r>
+    </w:p>
+    <w:p>
+      <w:pPr>
+        <w:spacing w:after="160"/>
+      </w:pPr>
+      <w:r>
+        <w:rPr>
+          <w:rFonts w:ascii="Aptos" w:hAnsi="Aptos"/>
+          <w:sz w:val="22"/>
+        </w:rPr>
+        <w:t>where L and R are the two sub-clusters at a split and α allocates more of the parent's weight to the lower-variance side, recursively down to single assets.</w:t>
+      </w:r>
+    </w:p>
+    <w:p>
       <w:r>
         <w:br w:type="page"/>
       </w:r>

</xml_diff>

<commit_message>
Report review pass: correct Section 4.2 idiom-dilution examples
Pre-submission review of 9 flagged claims (log 25). Only P4 needed a
draft edit: the 204-vs-473 dilution was illustrated with wrong examples
("rate hike" is in the core 204 set; "central bank"/"cost cutting" were
rejected) and mischaracterised as high-frequency boilerplate, when the
diluting idioms are rare freq-3 fragments. Fixed the examples and framing
in Section 4.2 and Appendix B with an inline HUMAN EDIT flag; the
mechanism (quality falls as the frequency floor drops) still holds.

Other 8 points: Confirmed (P1,P3,P5,P6,P7,P9) or Flagged for Ryan
(P2 tangency reasoning, P8 reference reconciliation) - no silent fixes.
Body 4,364 words, 0 em dashes.

Co-Authored-By: Claude Opus 4.8 <noreply@anthropic.com>
</commit_message>
<xml_diff>
--- a/report/report.docx
+++ b/report/report.docx
@@ -2858,7 +2858,7 @@
           <w:rFonts w:ascii="Aptos" w:hAnsi="Aptos"/>
           <w:sz w:val="22"/>
         </w:rPr>
-        <w:t>The dilution has a clear cause. Reaching 473 idioms meant lowering the frequency threshold to admit rarer phrases, and the marginal candidates are lower quality: boilerplate such as "central bank", "rate hike", and "cost cutting" recurs constantly in finance writing but carries little directional sentiment. When these near-neutral phrases fire on many headlines, they add noise that dilutes the sharp signal from the original 204. A selective lexicon can beat a permissive one, though the effect here is small and specific to this sample. A careful extension that does not beat a larger baseline, clearly explained, is still a genuine result.</w:t>
+        <w:t>The dilution has a clear cause. Reaching 473 idioms meant lowering the frequency threshold to admit rarer phrases, and the marginal candidates are lower quality: the second round pulled in fragmentary, low-frequency n-grams such as "drop as outlook", "discovery reports jump", and "added just workers", each appearing only three times in the corpus and carrying ambiguous rather than clean directional sentiment. [HUMAN EDIT REQUIRED: this corrects the earlier draft, which illustrated the dilution with "central bank", "rate hike", and "cost cutting" as high-frequency boilerplate. The data contradicts that: "rate hike" is in the core 204 set with valence -1.0, "central bank" and "cost cutting" were rejected entirely, and the genuinely diluting idioms are the rare three-occurrence fragments listed above (round-two candidate frequency floor was 3, versus 4 and up in round one). Reword this mechanism in your own words: the marginal idioms are rare and fragmentary, not high-frequency boilerplate.] These noisy matches dilute the sharp signal from the original 204. A selective lexicon can beat a permissive one, though the effect here is small and specific to this sample. A careful extension that does not beat a larger baseline, clearly explained, is still a genuine result.</w:t>
       </w:r>
     </w:p>
     <w:p>
@@ -3716,7 +3716,7 @@
           <w:rFonts w:ascii="Aptos" w:hAnsi="Aptos"/>
           <w:sz w:val="22"/>
         </w:rPr>
-        <w:t>The following mined phrases sit near the sentiment boundary and should be reviewed before final submission: "biggest analyst calls", "central bank", "rate hike", and "cost cutting". Source: ai/prompt_log_08_idioms.md and results/lexicon/kept_idioms.csv.</w:t>
+        <w:t>The following kept idioms sit closest to the retention floor (|mean valence| = 0.5) and should be reviewed before final submission: "restructuring plan" (-0.50), "share sale" (-0.50), "take private" (+0.70), and "turnaround plan" (+0.80). Source: results/lexicon/kept_idioms.csv.</w:t>
       </w:r>
     </w:p>
     <w:p>

</xml_diff>